<commit_message>
remove RV201 (copied from RV200) documents
</commit_message>
<xml_diff>
--- a/Document/RV200/RW-TF-FST-02-04(00) Software Requirements Specifications (SRS).docx
+++ b/Document/RV200/RW-TF-FST-02-04(00) Software Requirements Specifications (SRS).docx
@@ -50,7 +50,7 @@
                 <w:szCs w:val="72"/>
                 <w:lang w:eastAsia="ko-KR"/>
               </w:rPr>
-              <w:t>Software Requirements Specification</w:t>
+              <w:t>Software Requirement Specification</w:t>
             </w:r>
           </w:p>
         </w:tc>
@@ -3527,8 +3527,9 @@
           <w:lang w:eastAsia="ko-KR"/>
         </w:rPr>
         <w:br/>
-        <w:t>4. Create date: timestamp without time zone (YYYY-MM-DD HH:MM:SS)</w:t>
+        <w:t>4. Create date: timestamp without time zone (YYYY-MM-DD HH:</w:t>
       </w:r>
+      <w:proofErr w:type="gramStart"/>
       <w:r>
         <w:rPr>
           <w:rFonts w:ascii="Times New Roman" w:hAnsi="Times New Roman" w:cs="Times New Roman"/>
@@ -3536,8 +3537,47 @@
           <w:shd w:val="clear" w:color="auto" w:fill="FFFFFF"/>
           <w:lang w:eastAsia="ko-KR"/>
         </w:rPr>
+        <w:t>MM:SS</w:t>
+      </w:r>
+      <w:proofErr w:type="gramEnd"/>
+      <w:r>
+        <w:rPr>
+          <w:rFonts w:ascii="Times New Roman" w:hAnsi="Times New Roman" w:cs="Times New Roman"/>
+          <w:color w:val="0D0D0D"/>
+          <w:shd w:val="clear" w:color="auto" w:fill="FFFFFF"/>
+          <w:lang w:eastAsia="ko-KR"/>
+        </w:rPr>
+        <w:t>)</w:t>
+      </w:r>
+      <w:r>
+        <w:rPr>
+          <w:rFonts w:ascii="Times New Roman" w:hAnsi="Times New Roman" w:cs="Times New Roman"/>
+          <w:color w:val="0D0D0D"/>
+          <w:shd w:val="clear" w:color="auto" w:fill="FFFFFF"/>
+          <w:lang w:eastAsia="ko-KR"/>
+        </w:rPr>
         <w:br/>
-        <w:t>5. Update date: timestamp without time zone (YYYY-MM-DD HH:MM:SS)</w:t>
+        <w:t>5. Update date: timestamp without time zone (YYYY-MM-DD HH:</w:t>
+      </w:r>
+      <w:proofErr w:type="gramStart"/>
+      <w:r>
+        <w:rPr>
+          <w:rFonts w:ascii="Times New Roman" w:hAnsi="Times New Roman" w:cs="Times New Roman"/>
+          <w:color w:val="0D0D0D"/>
+          <w:shd w:val="clear" w:color="auto" w:fill="FFFFFF"/>
+          <w:lang w:eastAsia="ko-KR"/>
+        </w:rPr>
+        <w:t>MM:SS</w:t>
+      </w:r>
+      <w:proofErr w:type="gramEnd"/>
+      <w:r>
+        <w:rPr>
+          <w:rFonts w:ascii="Times New Roman" w:hAnsi="Times New Roman" w:cs="Times New Roman"/>
+          <w:color w:val="0D0D0D"/>
+          <w:shd w:val="clear" w:color="auto" w:fill="FFFFFF"/>
+          <w:lang w:eastAsia="ko-KR"/>
+        </w:rPr>
+        <w:t>)</w:t>
       </w:r>
       <w:r>
         <w:rPr>
@@ -5687,6 +5727,26 @@
 </file>
 
 <file path=customXml/item1.xml><?xml version="1.0" encoding="utf-8"?>
+<p:properties xmlns:p="http://schemas.microsoft.com/office/2006/metadata/properties" xmlns:xsi="http://www.w3.org/2001/XMLSchema-instance" xmlns:pc="http://schemas.microsoft.com/office/infopath/2007/PartnerControls">
+  <documentManagement>
+    <lcf76f155ced4ddcb4097134ff3c332f xmlns="e9585e3e-8dde-4558-9020-300460070f66">
+      <Terms xmlns="http://schemas.microsoft.com/office/infopath/2007/PartnerControls"/>
+    </lcf76f155ced4ddcb4097134ff3c332f>
+    <TaxCatchAll xmlns="fdbd0ee6-c1ce-4682-bf4d-b990274ef7f9" xsi:nil="true"/>
+  </documentManagement>
+</p:properties>
+</file>
+
+<file path=customXml/item2.xml><?xml version="1.0" encoding="utf-8"?>
+<?mso-contentType ?>
+<FormTemplates xmlns="http://schemas.microsoft.com/sharepoint/v3/contenttype/forms">
+  <Display>DocumentLibraryForm</Display>
+  <Edit>DocumentLibraryForm</Edit>
+  <New>DocumentLibraryForm</New>
+</FormTemplates>
+</file>
+
+<file path=customXml/item3.xml><?xml version="1.0" encoding="utf-8"?>
 <ct:contentTypeSchema xmlns:ct="http://schemas.microsoft.com/office/2006/metadata/contentType" xmlns:ma="http://schemas.microsoft.com/office/2006/metadata/properties/metaAttributes" ct:_="" ma:_="" ma:contentTypeName="문서" ma:contentTypeID="0x01010055643D1FCDD1AF449E52FCC5650E658B" ma:contentTypeVersion="14" ma:contentTypeDescription="새 문서를 만듭니다." ma:contentTypeScope="" ma:versionID="647bdb025269980e27106cc2d7c93b4b">
   <xsd:schema xmlns:xsd="http://www.w3.org/2001/XMLSchema" xmlns:xs="http://www.w3.org/2001/XMLSchema" xmlns:p="http://schemas.microsoft.com/office/2006/metadata/properties" xmlns:ns2="e9585e3e-8dde-4558-9020-300460070f66" xmlns:ns3="fdbd0ee6-c1ce-4682-bf4d-b990274ef7f9" targetNamespace="http://schemas.microsoft.com/office/2006/metadata/properties" ma:root="true" ma:fieldsID="d9d8955b532099d955db877a9cb0cef3" ns2:_="" ns3:_="">
     <xsd:import namespace="e9585e3e-8dde-4558-9020-300460070f66"/>
@@ -5899,27 +5959,26 @@
 </ct:contentTypeSchema>
 </file>
 
-<file path=customXml/item2.xml><?xml version="1.0" encoding="utf-8"?>
-<?mso-contentType ?>
-<FormTemplates xmlns="http://schemas.microsoft.com/sharepoint/v3/contenttype/forms">
-  <Display>DocumentLibraryForm</Display>
-  <Edit>DocumentLibraryForm</Edit>
-  <New>DocumentLibraryForm</New>
-</FormTemplates>
+<file path=customXml/itemProps1.xml><?xml version="1.0" encoding="utf-8"?>
+<ds:datastoreItem xmlns:ds="http://schemas.openxmlformats.org/officeDocument/2006/customXml" ds:itemID="{85369CCB-D647-4B64-B8EB-725EB53B7A1C}">
+  <ds:schemaRefs>
+    <ds:schemaRef ds:uri="http://schemas.microsoft.com/office/2006/metadata/properties"/>
+    <ds:schemaRef ds:uri="http://schemas.microsoft.com/office/infopath/2007/PartnerControls"/>
+    <ds:schemaRef ds:uri="e9585e3e-8dde-4558-9020-300460070f66"/>
+    <ds:schemaRef ds:uri="fdbd0ee6-c1ce-4682-bf4d-b990274ef7f9"/>
+  </ds:schemaRefs>
+</ds:datastoreItem>
 </file>
 
-<file path=customXml/item3.xml><?xml version="1.0" encoding="utf-8"?>
-<p:properties xmlns:p="http://schemas.microsoft.com/office/2006/metadata/properties" xmlns:xsi="http://www.w3.org/2001/XMLSchema-instance" xmlns:pc="http://schemas.microsoft.com/office/infopath/2007/PartnerControls">
-  <documentManagement>
-    <lcf76f155ced4ddcb4097134ff3c332f xmlns="e9585e3e-8dde-4558-9020-300460070f66">
-      <Terms xmlns="http://schemas.microsoft.com/office/infopath/2007/PartnerControls"/>
-    </lcf76f155ced4ddcb4097134ff3c332f>
-    <TaxCatchAll xmlns="fdbd0ee6-c1ce-4682-bf4d-b990274ef7f9" xsi:nil="true"/>
-  </documentManagement>
-</p:properties>
+<file path=customXml/itemProps2.xml><?xml version="1.0" encoding="utf-8"?>
+<ds:datastoreItem xmlns:ds="http://schemas.openxmlformats.org/officeDocument/2006/customXml" ds:itemID="{AB1C3B01-93D8-4F5A-B41E-78AA000F7125}">
+  <ds:schemaRefs>
+    <ds:schemaRef ds:uri="http://schemas.microsoft.com/sharepoint/v3/contenttype/forms"/>
+  </ds:schemaRefs>
+</ds:datastoreItem>
 </file>
 
-<file path=customXml/itemProps1.xml><?xml version="1.0" encoding="utf-8"?>
+<file path=customXml/itemProps3.xml><?xml version="1.0" encoding="utf-8"?>
 <ds:datastoreItem xmlns:ds="http://schemas.openxmlformats.org/officeDocument/2006/customXml" ds:itemID="{6DAC270D-93DF-4363-B6A7-647E80BCB8C9}">
   <ds:schemaRefs>
     <ds:schemaRef ds:uri="http://schemas.microsoft.com/office/2006/metadata/contentType"/>
@@ -5936,23 +5995,4 @@
     <ds:schemaRef ds:uri="http://schemas.microsoft.com/internal/obd"/>
   </ds:schemaRefs>
 </ds:datastoreItem>
-</file>
-
-<file path=customXml/itemProps2.xml><?xml version="1.0" encoding="utf-8"?>
-<ds:datastoreItem xmlns:ds="http://schemas.openxmlformats.org/officeDocument/2006/customXml" ds:itemID="{AB1C3B01-93D8-4F5A-B41E-78AA000F7125}">
-  <ds:schemaRefs>
-    <ds:schemaRef ds:uri="http://schemas.microsoft.com/sharepoint/v3/contenttype/forms"/>
-  </ds:schemaRefs>
-</ds:datastoreItem>
-</file>
-
-<file path=customXml/itemProps3.xml><?xml version="1.0" encoding="utf-8"?>
-<ds:datastoreItem xmlns:ds="http://schemas.openxmlformats.org/officeDocument/2006/customXml" ds:itemID="{85369CCB-D647-4B64-B8EB-725EB53B7A1C}">
-  <ds:schemaRefs>
-    <ds:schemaRef ds:uri="http://schemas.microsoft.com/office/2006/metadata/properties"/>
-    <ds:schemaRef ds:uri="http://schemas.microsoft.com/office/infopath/2007/PartnerControls"/>
-    <ds:schemaRef ds:uri="e9585e3e-8dde-4558-9020-300460070f66"/>
-    <ds:schemaRef ds:uri="fdbd0ee6-c1ce-4682-bf4d-b990274ef7f9"/>
-  </ds:schemaRefs>
-</ds:datastoreItem>
 </file>
</xml_diff>